<commit_message>
wip: design model for the project.
</commit_message>
<xml_diff>
--- a/02-Documentation/04-design-model/design-model.docx
+++ b/02-Documentation/04-design-model/design-model.docx
@@ -614,12 +614,304 @@
     </w:p>
     <w:p>
       <w:pPr>
-        <w:rPr>
-          <w:rFonts w:ascii="Arial" w:hAnsi="Arial" w:cs="Arial"/>
-          <w:b/>
-          <w:bCs/>
-          <w:sz w:val="40"/>
-          <w:szCs w:val="40"/>
+        <w:ind w:left="360"/>
+        <w:rPr>
+          <w:rFonts w:ascii="Arial" w:hAnsi="Arial" w:cs="Arial"/>
+        </w:rPr>
+      </w:pPr>
+      <w:r>
+        <w:rPr>
+          <w:rFonts w:ascii="Arial" w:hAnsi="Arial" w:cs="Arial"/>
+        </w:rPr>
+        <w:t xml:space="preserve">Para el modelo </w:t>
+      </w:r>
+      <w:r>
+        <w:rPr>
+          <w:rFonts w:ascii="Arial" w:hAnsi="Arial" w:cs="Arial"/>
+        </w:rPr>
+        <w:t>de diseño se ha optado por MVC (Modelo – Vista – Controlador).</w:t>
+      </w:r>
+    </w:p>
+    <w:p>
+      <w:pPr>
+        <w:ind w:left="360"/>
+        <w:jc w:val="both"/>
+        <w:rPr>
+          <w:rFonts w:ascii="Arial" w:hAnsi="Arial" w:cs="Arial"/>
+        </w:rPr>
+      </w:pPr>
+      <w:r>
+        <w:rPr>
+          <w:rFonts w:ascii="Arial" w:hAnsi="Arial" w:cs="Arial"/>
+        </w:rPr>
+        <w:t>Ya que ayuda a mantener la modularidad y mantenibilidad del proyecto. Siendo una ventaja también su escalabilidad para la programación orientada a objetos.</w:t>
+      </w:r>
+    </w:p>
+    <w:p>
+      <w:pPr>
+        <w:ind w:left="360"/>
+        <w:jc w:val="both"/>
+        <w:rPr>
+          <w:rFonts w:ascii="Arial" w:hAnsi="Arial" w:cs="Arial"/>
+        </w:rPr>
+      </w:pPr>
+      <w:r>
+        <w:rPr>
+          <w:rFonts w:ascii="Arial" w:hAnsi="Arial" w:cs="Arial"/>
+        </w:rPr>
+        <w:t>Permitiendo separar la lógica del negocio, gestión de datos y las interfaces del usuario. Siendo el modelo quién represente la tabla de bases de datos y datos del sistema; la vista responde por la interacción con el usuario y los controladores gestionan las solicitudes y la comunicación entre las diferentes partes de la aplicación.</w:t>
+      </w:r>
+    </w:p>
+    <w:p>
+      <w:pPr>
+        <w:ind w:left="360"/>
+        <w:jc w:val="both"/>
+        <w:rPr>
+          <w:rFonts w:ascii="Arial" w:hAnsi="Arial" w:cs="Arial"/>
+        </w:rPr>
+      </w:pPr>
+      <w:r>
+        <w:rPr>
+          <w:rFonts w:ascii="Arial" w:hAnsi="Arial" w:cs="Arial"/>
+        </w:rPr>
+        <w:t>Pero, a nivel personal, se ha optado por una variante que es: separar responsabilidades + MVC.</w:t>
+      </w:r>
+    </w:p>
+    <w:p>
+      <w:pPr>
+        <w:ind w:left="360"/>
+        <w:jc w:val="both"/>
+        <w:rPr>
+          <w:rFonts w:ascii="Arial" w:hAnsi="Arial" w:cs="Arial"/>
+          <w:i/>
+          <w:iCs/>
+        </w:rPr>
+      </w:pPr>
+      <w:r>
+        <w:rPr>
+          <w:rFonts w:ascii="Arial" w:hAnsi="Arial" w:cs="Arial"/>
+        </w:rPr>
+        <w:t xml:space="preserve">Ya que en un grupo de trabajo siempre existen roles, y estos normalmente se segmentan en grupos como: </w:t>
+      </w:r>
+      <w:proofErr w:type="spellStart"/>
+      <w:r>
+        <w:rPr>
+          <w:rFonts w:ascii="Arial" w:hAnsi="Arial" w:cs="Arial"/>
+        </w:rPr>
+        <w:t>tester</w:t>
+      </w:r>
+      <w:proofErr w:type="spellEnd"/>
+      <w:r>
+        <w:rPr>
+          <w:rFonts w:ascii="Arial" w:hAnsi="Arial" w:cs="Arial"/>
+        </w:rPr>
+        <w:t xml:space="preserve">, documentación, </w:t>
+      </w:r>
+      <w:r>
+        <w:rPr>
+          <w:rFonts w:ascii="Arial" w:hAnsi="Arial" w:cs="Arial"/>
+          <w:i/>
+          <w:iCs/>
+        </w:rPr>
+        <w:t xml:space="preserve">frontend, backend </w:t>
+      </w:r>
+      <w:r>
+        <w:rPr>
+          <w:rFonts w:ascii="Arial" w:hAnsi="Arial" w:cs="Arial"/>
+        </w:rPr>
+        <w:t xml:space="preserve">y </w:t>
+      </w:r>
+      <w:r>
+        <w:rPr>
+          <w:rFonts w:ascii="Arial" w:hAnsi="Arial" w:cs="Arial"/>
+          <w:i/>
+          <w:iCs/>
+        </w:rPr>
+        <w:t>administrador de base de datos.</w:t>
+      </w:r>
+    </w:p>
+    <w:p>
+      <w:pPr>
+        <w:ind w:left="360"/>
+        <w:jc w:val="both"/>
+        <w:rPr>
+          <w:rFonts w:ascii="Arial" w:hAnsi="Arial" w:cs="Arial"/>
+        </w:rPr>
+      </w:pPr>
+      <w:r>
+        <w:rPr>
+          <w:rFonts w:ascii="Arial" w:hAnsi="Arial" w:cs="Arial"/>
+        </w:rPr>
+        <w:t xml:space="preserve">Al tener MVC hay archivos de la carpeta modelos o controlador que debe manipular el frontend, siendo algo ‘tedioso’ o ‘arriesgado’ ya que se está trabajando en un entorno diferente. Por </w:t>
+      </w:r>
+      <w:proofErr w:type="gramStart"/>
+      <w:r>
+        <w:rPr>
+          <w:rFonts w:ascii="Arial" w:hAnsi="Arial" w:cs="Arial"/>
+        </w:rPr>
+        <w:t>ende</w:t>
+      </w:r>
+      <w:proofErr w:type="gramEnd"/>
+      <w:r>
+        <w:rPr>
+          <w:rFonts w:ascii="Arial" w:hAnsi="Arial" w:cs="Arial"/>
+        </w:rPr>
+        <w:t xml:space="preserve"> antes de hacer MVC, se crea una carpeta raíz llamada Src, con 3 subcarpetas que contiene los roles principales: Frontend, Backend y Database. </w:t>
+      </w:r>
+    </w:p>
+    <w:p>
+      <w:pPr>
+        <w:ind w:left="360"/>
+        <w:jc w:val="both"/>
+        <w:rPr>
+          <w:rFonts w:ascii="Arial" w:hAnsi="Arial" w:cs="Arial"/>
+        </w:rPr>
+      </w:pPr>
+      <w:r>
+        <w:rPr>
+          <w:rFonts w:ascii="Arial" w:hAnsi="Arial" w:cs="Arial"/>
+        </w:rPr>
+        <w:t xml:space="preserve">Cada subcarpeta teniendo </w:t>
+      </w:r>
+      <w:r>
+        <w:rPr>
+          <w:rFonts w:ascii="Arial" w:hAnsi="Arial" w:cs="Arial"/>
+        </w:rPr>
+        <w:t>el contenido que es pertinente de su área.</w:t>
+      </w:r>
+    </w:p>
+    <w:p>
+      <w:pPr>
+        <w:ind w:left="360"/>
+        <w:jc w:val="both"/>
+        <w:rPr>
+          <w:rFonts w:ascii="Arial" w:hAnsi="Arial" w:cs="Arial"/>
+        </w:rPr>
+      </w:pPr>
+    </w:p>
+    <w:p>
+      <w:pPr>
+        <w:ind w:left="360"/>
+        <w:jc w:val="both"/>
+        <w:rPr>
+          <w:rFonts w:ascii="Arial" w:hAnsi="Arial" w:cs="Arial"/>
+        </w:rPr>
+      </w:pPr>
+    </w:p>
+    <w:p>
+      <w:pPr>
+        <w:ind w:left="360"/>
+        <w:jc w:val="both"/>
+        <w:rPr>
+          <w:rFonts w:ascii="Arial" w:hAnsi="Arial" w:cs="Arial"/>
+        </w:rPr>
+      </w:pPr>
+    </w:p>
+    <w:p>
+      <w:pPr>
+        <w:ind w:left="360"/>
+        <w:jc w:val="both"/>
+        <w:rPr>
+          <w:rFonts w:ascii="Arial" w:hAnsi="Arial" w:cs="Arial"/>
+        </w:rPr>
+      </w:pPr>
+    </w:p>
+    <w:p>
+      <w:pPr>
+        <w:ind w:left="360"/>
+        <w:jc w:val="both"/>
+        <w:rPr>
+          <w:rFonts w:ascii="Arial" w:hAnsi="Arial" w:cs="Arial"/>
+        </w:rPr>
+      </w:pPr>
+    </w:p>
+    <w:p>
+      <w:pPr>
+        <w:ind w:left="360"/>
+        <w:jc w:val="both"/>
+        <w:rPr>
+          <w:rFonts w:ascii="Arial" w:hAnsi="Arial" w:cs="Arial"/>
+        </w:rPr>
+      </w:pPr>
+    </w:p>
+    <w:p>
+      <w:pPr>
+        <w:ind w:left="360"/>
+        <w:jc w:val="both"/>
+        <w:rPr>
+          <w:rFonts w:ascii="Arial" w:hAnsi="Arial" w:cs="Arial"/>
+        </w:rPr>
+      </w:pPr>
+    </w:p>
+    <w:p>
+      <w:pPr>
+        <w:ind w:left="360"/>
+        <w:jc w:val="both"/>
+        <w:rPr>
+          <w:rFonts w:ascii="Arial" w:hAnsi="Arial" w:cs="Arial"/>
+        </w:rPr>
+      </w:pPr>
+    </w:p>
+    <w:p>
+      <w:pPr>
+        <w:ind w:left="360"/>
+        <w:jc w:val="both"/>
+        <w:rPr>
+          <w:rFonts w:ascii="Arial" w:hAnsi="Arial" w:cs="Arial"/>
+        </w:rPr>
+      </w:pPr>
+    </w:p>
+    <w:p>
+      <w:pPr>
+        <w:ind w:left="360"/>
+        <w:jc w:val="both"/>
+        <w:rPr>
+          <w:rFonts w:ascii="Arial" w:hAnsi="Arial" w:cs="Arial"/>
+        </w:rPr>
+      </w:pPr>
+    </w:p>
+    <w:p>
+      <w:pPr>
+        <w:ind w:left="360"/>
+        <w:jc w:val="both"/>
+        <w:rPr>
+          <w:rFonts w:ascii="Arial" w:hAnsi="Arial" w:cs="Arial"/>
+        </w:rPr>
+      </w:pPr>
+    </w:p>
+    <w:p>
+      <w:pPr>
+        <w:ind w:left="360"/>
+        <w:jc w:val="both"/>
+        <w:rPr>
+          <w:rFonts w:ascii="Arial" w:hAnsi="Arial" w:cs="Arial"/>
+        </w:rPr>
+      </w:pPr>
+    </w:p>
+    <w:p>
+      <w:pPr>
+        <w:ind w:left="360"/>
+        <w:jc w:val="both"/>
+        <w:rPr>
+          <w:rFonts w:ascii="Arial" w:hAnsi="Arial" w:cs="Arial"/>
+        </w:rPr>
+      </w:pPr>
+    </w:p>
+    <w:p>
+      <w:pPr>
+        <w:ind w:left="360"/>
+        <w:jc w:val="both"/>
+        <w:rPr>
+          <w:rFonts w:ascii="Arial" w:hAnsi="Arial" w:cs="Arial"/>
+        </w:rPr>
+      </w:pPr>
+    </w:p>
+    <w:p>
+      <w:pPr>
+        <w:ind w:left="360"/>
+        <w:jc w:val="both"/>
+        <w:rPr>
+          <w:rFonts w:ascii="Arial" w:hAnsi="Arial" w:cs="Arial"/>
         </w:rPr>
       </w:pPr>
     </w:p>
@@ -646,6 +938,7 @@
           <w:sz w:val="40"/>
           <w:szCs w:val="40"/>
         </w:rPr>
+        <w:lastRenderedPageBreak/>
         <w:t>ARQUITECTURA SELECCIONADA</w:t>
       </w:r>
     </w:p>
@@ -835,6 +1128,30 @@
           <w:szCs w:val="40"/>
         </w:rPr>
       </w:pPr>
+    </w:p>
+    <w:p>
+      <w:pPr>
+        <w:rPr>
+          <w:rFonts w:ascii="Arial" w:hAnsi="Arial" w:cs="Arial"/>
+          <w:b/>
+          <w:bCs/>
+          <w:sz w:val="40"/>
+          <w:szCs w:val="40"/>
+        </w:rPr>
+      </w:pPr>
+    </w:p>
+    <w:p>
+      <w:pPr>
+        <w:rPr>
+          <w:rFonts w:ascii="Arial" w:hAnsi="Arial" w:cs="Arial"/>
+          <w:b/>
+          <w:bCs/>
+          <w:sz w:val="40"/>
+          <w:szCs w:val="40"/>
+        </w:rPr>
+      </w:pPr>
+      <w:bookmarkStart w:id="0" w:name="_GoBack"/>
+      <w:bookmarkEnd w:id="0"/>
     </w:p>
     <w:p>
       <w:pPr>
@@ -2273,8 +2590,6 @@
           <w:szCs w:val="40"/>
         </w:rPr>
       </w:pPr>
-      <w:bookmarkStart w:id="0" w:name="_GoBack"/>
-      <w:bookmarkEnd w:id="0"/>
     </w:p>
     <w:p>
       <w:pPr>

</xml_diff>

<commit_message>
release: first delivery of the document.
</commit_message>
<xml_diff>
--- a/02-Documentation/04-design-model/design-model.docx
+++ b/02-Documentation/04-design-model/design-model.docx
@@ -1150,8 +1150,6 @@
           <w:szCs w:val="40"/>
         </w:rPr>
       </w:pPr>
-      <w:bookmarkStart w:id="0" w:name="_GoBack"/>
-      <w:bookmarkEnd w:id="0"/>
     </w:p>
     <w:p>
       <w:pPr>
@@ -2159,7 +2157,15 @@
         <w:rPr>
           <w:rFonts w:ascii="Arial" w:hAnsi="Arial" w:cs="Arial"/>
         </w:rPr>
-        <w:t xml:space="preserve"> facilita la creación de interfaces basadas en componentes, permitiendo reutilizar código y mejorar la organización del backend.</w:t>
+        <w:t xml:space="preserve"> facilita la creación de interfaces basadas en</w:t>
+      </w:r>
+      <w:bookmarkStart w:id="0" w:name="_GoBack"/>
+      <w:bookmarkEnd w:id="0"/>
+      <w:r>
+        <w:rPr>
+          <w:rFonts w:ascii="Arial" w:hAnsi="Arial" w:cs="Arial"/>
+        </w:rPr>
+        <w:t xml:space="preserve"> componentes, permitiendo reutilizar código y mejorar la organización del backend.</w:t>
       </w:r>
     </w:p>
     <w:p>
@@ -2628,6 +2634,499 @@
         <w:lastRenderedPageBreak/>
         <w:t>ESTÁNDARES DE CALIDAD APLICABLE</w:t>
       </w:r>
+    </w:p>
+    <w:p>
+      <w:pPr>
+        <w:spacing w:before="100" w:beforeAutospacing="1" w:after="100" w:afterAutospacing="1" w:line="240" w:lineRule="auto"/>
+        <w:jc w:val="both"/>
+        <w:rPr>
+          <w:rFonts w:ascii="Arial" w:eastAsia="Times New Roman" w:hAnsi="Arial" w:cs="Arial"/>
+          <w:lang w:eastAsia="es-CO"/>
+        </w:rPr>
+      </w:pPr>
+      <w:r>
+        <w:rPr>
+          <w:rFonts w:ascii="Arial" w:eastAsia="Times New Roman" w:hAnsi="Arial" w:cs="Arial"/>
+          <w:b/>
+          <w:bCs/>
+          <w:lang w:eastAsia="es-CO"/>
+        </w:rPr>
+        <w:t>ISO/IEC 25010</w:t>
+      </w:r>
+      <w:r>
+        <w:rPr>
+          <w:rFonts w:ascii="Arial" w:eastAsia="Times New Roman" w:hAnsi="Arial" w:cs="Arial"/>
+          <w:lang w:eastAsia="es-CO"/>
+        </w:rPr>
+        <w:t xml:space="preserve"> sería la principal, porque permite evaluar características de calidad del software como:</w:t>
+      </w:r>
+    </w:p>
+    <w:p>
+      <w:pPr>
+        <w:numPr>
+          <w:ilvl w:val="0"/>
+          <w:numId w:val="6"/>
+        </w:numPr>
+        <w:spacing w:before="100" w:beforeAutospacing="1" w:after="100" w:afterAutospacing="1" w:line="240" w:lineRule="auto"/>
+        <w:jc w:val="both"/>
+        <w:rPr>
+          <w:rFonts w:ascii="Arial" w:eastAsia="Times New Roman" w:hAnsi="Arial" w:cs="Arial"/>
+          <w:lang w:eastAsia="es-CO"/>
+        </w:rPr>
+      </w:pPr>
+      <w:r>
+        <w:rPr>
+          <w:rFonts w:ascii="Arial" w:eastAsia="Times New Roman" w:hAnsi="Arial" w:cs="Arial"/>
+          <w:lang w:eastAsia="es-CO"/>
+        </w:rPr>
+        <w:t xml:space="preserve">Adecuación funcional. </w:t>
+      </w:r>
+    </w:p>
+    <w:p>
+      <w:pPr>
+        <w:numPr>
+          <w:ilvl w:val="0"/>
+          <w:numId w:val="6"/>
+        </w:numPr>
+        <w:spacing w:before="100" w:beforeAutospacing="1" w:after="100" w:afterAutospacing="1" w:line="240" w:lineRule="auto"/>
+        <w:jc w:val="both"/>
+        <w:rPr>
+          <w:rFonts w:ascii="Arial" w:eastAsia="Times New Roman" w:hAnsi="Arial" w:cs="Arial"/>
+          <w:lang w:eastAsia="es-CO"/>
+        </w:rPr>
+      </w:pPr>
+      <w:r>
+        <w:rPr>
+          <w:rFonts w:ascii="Arial" w:eastAsia="Times New Roman" w:hAnsi="Arial" w:cs="Arial"/>
+          <w:lang w:eastAsia="es-CO"/>
+        </w:rPr>
+        <w:t xml:space="preserve">Eficiencia de desempeño. </w:t>
+      </w:r>
+    </w:p>
+    <w:p>
+      <w:pPr>
+        <w:numPr>
+          <w:ilvl w:val="0"/>
+          <w:numId w:val="6"/>
+        </w:numPr>
+        <w:spacing w:before="100" w:beforeAutospacing="1" w:after="100" w:afterAutospacing="1" w:line="240" w:lineRule="auto"/>
+        <w:jc w:val="both"/>
+        <w:rPr>
+          <w:rFonts w:ascii="Arial" w:eastAsia="Times New Roman" w:hAnsi="Arial" w:cs="Arial"/>
+          <w:lang w:eastAsia="es-CO"/>
+        </w:rPr>
+      </w:pPr>
+      <w:r>
+        <w:rPr>
+          <w:rFonts w:ascii="Arial" w:eastAsia="Times New Roman" w:hAnsi="Arial" w:cs="Arial"/>
+          <w:lang w:eastAsia="es-CO"/>
+        </w:rPr>
+        <w:t xml:space="preserve">Compatibilidad. </w:t>
+      </w:r>
+    </w:p>
+    <w:p>
+      <w:pPr>
+        <w:numPr>
+          <w:ilvl w:val="0"/>
+          <w:numId w:val="6"/>
+        </w:numPr>
+        <w:spacing w:before="100" w:beforeAutospacing="1" w:after="100" w:afterAutospacing="1" w:line="240" w:lineRule="auto"/>
+        <w:jc w:val="both"/>
+        <w:rPr>
+          <w:rFonts w:ascii="Arial" w:eastAsia="Times New Roman" w:hAnsi="Arial" w:cs="Arial"/>
+          <w:lang w:eastAsia="es-CO"/>
+        </w:rPr>
+      </w:pPr>
+      <w:r>
+        <w:rPr>
+          <w:rFonts w:ascii="Arial" w:eastAsia="Times New Roman" w:hAnsi="Arial" w:cs="Arial"/>
+          <w:lang w:eastAsia="es-CO"/>
+        </w:rPr>
+        <w:t xml:space="preserve">Usabilidad. </w:t>
+      </w:r>
+    </w:p>
+    <w:p>
+      <w:pPr>
+        <w:numPr>
+          <w:ilvl w:val="0"/>
+          <w:numId w:val="6"/>
+        </w:numPr>
+        <w:spacing w:before="100" w:beforeAutospacing="1" w:after="100" w:afterAutospacing="1" w:line="240" w:lineRule="auto"/>
+        <w:jc w:val="both"/>
+        <w:rPr>
+          <w:rFonts w:ascii="Arial" w:eastAsia="Times New Roman" w:hAnsi="Arial" w:cs="Arial"/>
+          <w:lang w:eastAsia="es-CO"/>
+        </w:rPr>
+      </w:pPr>
+      <w:r>
+        <w:rPr>
+          <w:rFonts w:ascii="Arial" w:eastAsia="Times New Roman" w:hAnsi="Arial" w:cs="Arial"/>
+          <w:lang w:eastAsia="es-CO"/>
+        </w:rPr>
+        <w:t xml:space="preserve">Fiabilidad. </w:t>
+      </w:r>
+    </w:p>
+    <w:p>
+      <w:pPr>
+        <w:numPr>
+          <w:ilvl w:val="0"/>
+          <w:numId w:val="6"/>
+        </w:numPr>
+        <w:spacing w:before="100" w:beforeAutospacing="1" w:after="100" w:afterAutospacing="1" w:line="240" w:lineRule="auto"/>
+        <w:jc w:val="both"/>
+        <w:rPr>
+          <w:rFonts w:ascii="Arial" w:eastAsia="Times New Roman" w:hAnsi="Arial" w:cs="Arial"/>
+          <w:lang w:eastAsia="es-CO"/>
+        </w:rPr>
+      </w:pPr>
+      <w:r>
+        <w:rPr>
+          <w:rFonts w:ascii="Arial" w:eastAsia="Times New Roman" w:hAnsi="Arial" w:cs="Arial"/>
+          <w:lang w:eastAsia="es-CO"/>
+        </w:rPr>
+        <w:t xml:space="preserve">Seguridad. </w:t>
+      </w:r>
+    </w:p>
+    <w:p>
+      <w:pPr>
+        <w:numPr>
+          <w:ilvl w:val="0"/>
+          <w:numId w:val="6"/>
+        </w:numPr>
+        <w:spacing w:before="100" w:beforeAutospacing="1" w:after="100" w:afterAutospacing="1" w:line="240" w:lineRule="auto"/>
+        <w:jc w:val="both"/>
+        <w:rPr>
+          <w:rFonts w:ascii="Arial" w:eastAsia="Times New Roman" w:hAnsi="Arial" w:cs="Arial"/>
+          <w:lang w:eastAsia="es-CO"/>
+        </w:rPr>
+      </w:pPr>
+      <w:r>
+        <w:rPr>
+          <w:rFonts w:ascii="Arial" w:eastAsia="Times New Roman" w:hAnsi="Arial" w:cs="Arial"/>
+          <w:lang w:eastAsia="es-CO"/>
+        </w:rPr>
+        <w:t xml:space="preserve">Mantenibilidad. </w:t>
+      </w:r>
+    </w:p>
+    <w:p>
+      <w:pPr>
+        <w:numPr>
+          <w:ilvl w:val="0"/>
+          <w:numId w:val="6"/>
+        </w:numPr>
+        <w:spacing w:before="100" w:beforeAutospacing="1" w:after="100" w:afterAutospacing="1" w:line="240" w:lineRule="auto"/>
+        <w:jc w:val="both"/>
+        <w:rPr>
+          <w:rFonts w:ascii="Arial" w:eastAsia="Times New Roman" w:hAnsi="Arial" w:cs="Arial"/>
+          <w:lang w:eastAsia="es-CO"/>
+        </w:rPr>
+      </w:pPr>
+      <w:r>
+        <w:rPr>
+          <w:rFonts w:ascii="Arial" w:eastAsia="Times New Roman" w:hAnsi="Arial" w:cs="Arial"/>
+          <w:lang w:eastAsia="es-CO"/>
+        </w:rPr>
+        <w:t xml:space="preserve">Portabilidad. </w:t>
+      </w:r>
+    </w:p>
+    <w:p>
+      <w:pPr>
+        <w:spacing w:before="100" w:beforeAutospacing="1" w:after="100" w:afterAutospacing="1" w:line="240" w:lineRule="auto"/>
+        <w:jc w:val="both"/>
+        <w:rPr>
+          <w:rFonts w:ascii="Arial" w:eastAsia="Times New Roman" w:hAnsi="Arial" w:cs="Arial"/>
+          <w:lang w:eastAsia="es-CO"/>
+        </w:rPr>
+      </w:pPr>
+      <w:r>
+        <w:rPr>
+          <w:rFonts w:ascii="Arial" w:eastAsia="Times New Roman" w:hAnsi="Arial" w:cs="Arial"/>
+          <w:lang w:eastAsia="es-CO"/>
+        </w:rPr>
+        <w:t>Y prácticamente sus RNF ya están apuntando hacia varias de estas características.</w:t>
+      </w:r>
+    </w:p>
+    <w:p>
+      <w:pPr>
+        <w:spacing w:before="100" w:beforeAutospacing="1" w:after="100" w:afterAutospacing="1" w:line="240" w:lineRule="auto"/>
+        <w:jc w:val="both"/>
+        <w:rPr>
+          <w:rFonts w:ascii="Arial" w:eastAsia="Times New Roman" w:hAnsi="Arial" w:cs="Arial"/>
+          <w:lang w:eastAsia="es-CO"/>
+        </w:rPr>
+      </w:pPr>
+      <w:r>
+        <w:rPr>
+          <w:rFonts w:ascii="Arial" w:eastAsia="Times New Roman" w:hAnsi="Arial" w:cs="Arial"/>
+          <w:lang w:eastAsia="es-CO"/>
+        </w:rPr>
+        <w:t>Por ejemplo:</w:t>
+      </w:r>
+    </w:p>
+    <w:p>
+      <w:pPr>
+        <w:numPr>
+          <w:ilvl w:val="0"/>
+          <w:numId w:val="7"/>
+        </w:numPr>
+        <w:spacing w:before="100" w:beforeAutospacing="1" w:after="100" w:afterAutospacing="1" w:line="240" w:lineRule="auto"/>
+        <w:jc w:val="both"/>
+        <w:rPr>
+          <w:rFonts w:ascii="Arial" w:eastAsia="Times New Roman" w:hAnsi="Arial" w:cs="Arial"/>
+          <w:lang w:eastAsia="es-CO"/>
+        </w:rPr>
+      </w:pPr>
+      <w:r>
+        <w:rPr>
+          <w:rFonts w:ascii="Arial" w:eastAsia="Times New Roman" w:hAnsi="Arial" w:cs="Arial"/>
+          <w:lang w:eastAsia="es-CO"/>
+        </w:rPr>
+        <w:t xml:space="preserve">El sistema debe responder en máximo </w:t>
+      </w:r>
+      <w:r>
+        <w:rPr>
+          <w:rFonts w:ascii="Arial" w:eastAsia="Times New Roman" w:hAnsi="Arial" w:cs="Arial"/>
+          <w:b/>
+          <w:bCs/>
+          <w:lang w:eastAsia="es-CO"/>
+        </w:rPr>
+        <w:t>3 segundos</w:t>
+      </w:r>
+      <w:r>
+        <w:rPr>
+          <w:rFonts w:ascii="Arial" w:eastAsia="Times New Roman" w:hAnsi="Arial" w:cs="Arial"/>
+          <w:lang w:eastAsia="es-CO"/>
+        </w:rPr>
+        <w:t xml:space="preserve"> → desempeño. </w:t>
+      </w:r>
+    </w:p>
+    <w:p>
+      <w:pPr>
+        <w:numPr>
+          <w:ilvl w:val="0"/>
+          <w:numId w:val="7"/>
+        </w:numPr>
+        <w:spacing w:before="100" w:beforeAutospacing="1" w:after="100" w:afterAutospacing="1" w:line="240" w:lineRule="auto"/>
+        <w:jc w:val="both"/>
+        <w:rPr>
+          <w:rFonts w:ascii="Arial" w:eastAsia="Times New Roman" w:hAnsi="Arial" w:cs="Arial"/>
+          <w:lang w:eastAsia="es-CO"/>
+        </w:rPr>
+      </w:pPr>
+      <w:r>
+        <w:rPr>
+          <w:rFonts w:ascii="Arial" w:eastAsia="Times New Roman" w:hAnsi="Arial" w:cs="Arial"/>
+          <w:lang w:eastAsia="es-CO"/>
+        </w:rPr>
+        <w:t xml:space="preserve">Debe ser </w:t>
+      </w:r>
+      <w:proofErr w:type="spellStart"/>
+      <w:r>
+        <w:rPr>
+          <w:rFonts w:ascii="Arial" w:eastAsia="Times New Roman" w:hAnsi="Arial" w:cs="Arial"/>
+          <w:b/>
+          <w:bCs/>
+          <w:lang w:eastAsia="es-CO"/>
+        </w:rPr>
+        <w:t>responsive</w:t>
+      </w:r>
+      <w:proofErr w:type="spellEnd"/>
+      <w:r>
+        <w:rPr>
+          <w:rFonts w:ascii="Arial" w:eastAsia="Times New Roman" w:hAnsi="Arial" w:cs="Arial"/>
+          <w:lang w:eastAsia="es-CO"/>
+        </w:rPr>
+        <w:t xml:space="preserve"> → usabilidad. </w:t>
+      </w:r>
+    </w:p>
+    <w:p>
+      <w:pPr>
+        <w:numPr>
+          <w:ilvl w:val="0"/>
+          <w:numId w:val="7"/>
+        </w:numPr>
+        <w:spacing w:before="100" w:beforeAutospacing="1" w:after="100" w:afterAutospacing="1" w:line="240" w:lineRule="auto"/>
+        <w:jc w:val="both"/>
+        <w:rPr>
+          <w:rFonts w:ascii="Arial" w:eastAsia="Times New Roman" w:hAnsi="Arial" w:cs="Arial"/>
+          <w:lang w:eastAsia="es-CO"/>
+        </w:rPr>
+      </w:pPr>
+      <w:r>
+        <w:rPr>
+          <w:rFonts w:ascii="Arial" w:eastAsia="Times New Roman" w:hAnsi="Arial" w:cs="Arial"/>
+          <w:lang w:eastAsia="es-CO"/>
+        </w:rPr>
+        <w:t xml:space="preserve">La interfaz debe ser amigable → usabilidad. </w:t>
+      </w:r>
+    </w:p>
+    <w:p>
+      <w:pPr>
+        <w:numPr>
+          <w:ilvl w:val="0"/>
+          <w:numId w:val="7"/>
+        </w:numPr>
+        <w:spacing w:before="100" w:beforeAutospacing="1" w:after="100" w:afterAutospacing="1" w:line="240" w:lineRule="auto"/>
+        <w:jc w:val="both"/>
+        <w:rPr>
+          <w:rFonts w:ascii="Arial" w:eastAsia="Times New Roman" w:hAnsi="Arial" w:cs="Arial"/>
+          <w:lang w:eastAsia="es-CO"/>
+        </w:rPr>
+      </w:pPr>
+      <w:r>
+        <w:rPr>
+          <w:rFonts w:ascii="Arial" w:eastAsia="Times New Roman" w:hAnsi="Arial" w:cs="Arial"/>
+          <w:lang w:eastAsia="es-CO"/>
+        </w:rPr>
+        <w:t xml:space="preserve">Las contraseñas deben almacenarse mediante </w:t>
+      </w:r>
+      <w:r>
+        <w:rPr>
+          <w:rFonts w:ascii="Arial" w:eastAsia="Times New Roman" w:hAnsi="Arial" w:cs="Arial"/>
+          <w:b/>
+          <w:bCs/>
+          <w:lang w:eastAsia="es-CO"/>
+        </w:rPr>
+        <w:t>hash</w:t>
+      </w:r>
+      <w:r>
+        <w:rPr>
+          <w:rFonts w:ascii="Arial" w:eastAsia="Times New Roman" w:hAnsi="Arial" w:cs="Arial"/>
+          <w:lang w:eastAsia="es-CO"/>
+        </w:rPr>
+        <w:t xml:space="preserve"> → seguridad. </w:t>
+      </w:r>
+    </w:p>
+    <w:p>
+      <w:pPr>
+        <w:numPr>
+          <w:ilvl w:val="0"/>
+          <w:numId w:val="7"/>
+        </w:numPr>
+        <w:spacing w:before="100" w:beforeAutospacing="1" w:after="100" w:afterAutospacing="1" w:line="240" w:lineRule="auto"/>
+        <w:jc w:val="both"/>
+        <w:rPr>
+          <w:rFonts w:ascii="Arial" w:eastAsia="Times New Roman" w:hAnsi="Arial" w:cs="Arial"/>
+          <w:lang w:eastAsia="es-CO"/>
+        </w:rPr>
+      </w:pPr>
+      <w:r>
+        <w:rPr>
+          <w:rFonts w:ascii="Arial" w:eastAsia="Times New Roman" w:hAnsi="Arial" w:cs="Arial"/>
+          <w:lang w:eastAsia="es-CO"/>
+        </w:rPr>
+        <w:t xml:space="preserve">La BD debe utilizar buenas prácticas e índices → eficiencia/mantenibilidad. </w:t>
+      </w:r>
+    </w:p>
+    <w:p>
+      <w:pPr>
+        <w:spacing w:before="100" w:beforeAutospacing="1" w:after="100" w:afterAutospacing="1" w:line="240" w:lineRule="auto"/>
+        <w:jc w:val="both"/>
+        <w:rPr>
+          <w:rFonts w:ascii="Arial" w:eastAsia="Times New Roman" w:hAnsi="Arial" w:cs="Arial"/>
+          <w:lang w:eastAsia="es-CO"/>
+        </w:rPr>
+      </w:pPr>
+      <w:r>
+        <w:rPr>
+          <w:rFonts w:ascii="Arial" w:eastAsia="Times New Roman" w:hAnsi="Arial" w:cs="Arial"/>
+          <w:lang w:eastAsia="es-CO"/>
+        </w:rPr>
+        <w:t xml:space="preserve">También aplicaría </w:t>
+      </w:r>
+      <w:r>
+        <w:rPr>
+          <w:rFonts w:ascii="Arial" w:eastAsia="Times New Roman" w:hAnsi="Arial" w:cs="Arial"/>
+          <w:b/>
+          <w:bCs/>
+          <w:lang w:eastAsia="es-CO"/>
+        </w:rPr>
+        <w:t>ISO/IEC/IEEE 29119</w:t>
+      </w:r>
+      <w:r>
+        <w:rPr>
+          <w:rFonts w:ascii="Arial" w:eastAsia="Times New Roman" w:hAnsi="Arial" w:cs="Arial"/>
+          <w:lang w:eastAsia="es-CO"/>
+        </w:rPr>
+        <w:t xml:space="preserve"> para las pruebas de software, porque ustedes ya tienen estructurados casos de prueba con </w:t>
+      </w:r>
+      <w:r>
+        <w:rPr>
+          <w:rFonts w:ascii="Arial" w:eastAsia="Times New Roman" w:hAnsi="Arial" w:cs="Arial"/>
+          <w:b/>
+          <w:bCs/>
+          <w:lang w:eastAsia="es-CO"/>
+        </w:rPr>
+        <w:t>ID, requisito, entrada, resultado esperado/obtenido y estado</w:t>
+      </w:r>
+      <w:r>
+        <w:rPr>
+          <w:rFonts w:ascii="Arial" w:eastAsia="Times New Roman" w:hAnsi="Arial" w:cs="Arial"/>
+          <w:lang w:eastAsia="es-CO"/>
+        </w:rPr>
+        <w:t xml:space="preserve">. </w:t>
+      </w:r>
+    </w:p>
+    <w:p>
+      <w:pPr>
+        <w:spacing w:before="100" w:beforeAutospacing="1" w:after="100" w:afterAutospacing="1" w:line="240" w:lineRule="auto"/>
+        <w:jc w:val="both"/>
+        <w:rPr>
+          <w:rFonts w:ascii="Arial" w:eastAsia="Times New Roman" w:hAnsi="Arial" w:cs="Arial"/>
+          <w:lang w:eastAsia="es-CO"/>
+        </w:rPr>
+      </w:pPr>
+      <w:r>
+        <w:rPr>
+          <w:rFonts w:ascii="Arial" w:eastAsia="Times New Roman" w:hAnsi="Arial" w:cs="Arial"/>
+          <w:lang w:eastAsia="es-CO"/>
+        </w:rPr>
+        <w:t xml:space="preserve">Y como estándar de codificación, pueden establecer </w:t>
+      </w:r>
+      <w:r>
+        <w:rPr>
+          <w:rFonts w:ascii="Arial" w:eastAsia="Times New Roman" w:hAnsi="Arial" w:cs="Arial"/>
+          <w:b/>
+          <w:bCs/>
+          <w:lang w:eastAsia="es-CO"/>
+        </w:rPr>
+        <w:t>convenciones de Java</w:t>
+      </w:r>
+      <w:r>
+        <w:rPr>
+          <w:rFonts w:ascii="Arial" w:eastAsia="Times New Roman" w:hAnsi="Arial" w:cs="Arial"/>
+          <w:lang w:eastAsia="es-CO"/>
+        </w:rPr>
+        <w:t xml:space="preserve">, nombres claros, separación de responsabilidades, principios </w:t>
+      </w:r>
+      <w:r>
+        <w:rPr>
+          <w:rFonts w:ascii="Arial" w:eastAsia="Times New Roman" w:hAnsi="Arial" w:cs="Arial"/>
+          <w:b/>
+          <w:bCs/>
+          <w:lang w:eastAsia="es-CO"/>
+        </w:rPr>
+        <w:t>SOLID</w:t>
+      </w:r>
+      <w:r>
+        <w:rPr>
+          <w:rFonts w:ascii="Arial" w:eastAsia="Times New Roman" w:hAnsi="Arial" w:cs="Arial"/>
+          <w:lang w:eastAsia="es-CO"/>
+        </w:rPr>
+        <w:t>, control de versiones con Git y revisión del código.</w:t>
+      </w:r>
+    </w:p>
+    <w:p>
+      <w:pPr>
+        <w:ind w:left="360"/>
+        <w:rPr>
+          <w:rFonts w:ascii="Arial" w:hAnsi="Arial" w:cs="Arial"/>
+          <w:b/>
+          <w:bCs/>
+          <w:sz w:val="40"/>
+          <w:szCs w:val="40"/>
+        </w:rPr>
+      </w:pPr>
     </w:p>
     <w:sectPr>
       <w:pgSz w:w="12240" w:h="15840"/>
@@ -2642,6 +3141,304 @@
 <file path=word/numbering.xml><?xml version="1.0" encoding="utf-8"?>
 <w:numbering xmlns:wpc="http://schemas.microsoft.com/office/word/2010/wordprocessingCanvas" xmlns:cx="http://schemas.microsoft.com/office/drawing/2014/chartex" xmlns:cx1="http://schemas.microsoft.com/office/drawing/2015/9/8/chartex" xmlns:cx2="http://schemas.microsoft.com/office/drawing/2015/10/21/chartex" xmlns:cx3="http://schemas.microsoft.com/office/drawing/2016/5/9/chartex" xmlns:cx4="http://schemas.microsoft.com/office/drawing/2016/5/10/chartex" xmlns:cx5="http://schemas.microsoft.com/office/drawing/2016/5/11/chartex" xmlns:cx6="http://schemas.microsoft.com/office/drawing/2016/5/12/chartex" xmlns:cx7="http://schemas.microsoft.com/office/drawing/2016/5/13/chartex" xmlns:cx8="http://schemas.microsoft.com/office/drawing/2016/5/14/chartex" xmlns:mc="http://schemas.openxmlformats.org/markup-compatibility/2006" xmlns:aink="http://schemas.microsoft.com/office/drawing/2016/ink" xmlns:am3d="http://schemas.microsoft.com/office/drawing/2017/model3d" xmlns:o="urn:schemas-microsoft-com:office:office" xmlns:r="http://schemas.openxmlformats.org/officeDocument/2006/relationships" xmlns:m="http://schemas.openxmlformats.org/officeDocument/2006/math" xmlns:v="urn:schemas-microsoft-com:vml" xmlns:wp14="http://schemas.microsoft.com/office/word/2010/wordprocessingDrawing" xmlns:wp="http://schemas.openxmlformats.org/drawingml/2006/wordprocessingDrawing" xmlns:w10="urn:schemas-microsoft-com:office:word" xmlns:w="http://schemas.openxmlformats.org/wordprocessingml/2006/main" xmlns:w14="http://schemas.microsoft.com/office/word/2010/wordml" xmlns:w15="http://schemas.microsoft.com/office/word/2012/wordml" xmlns:w16cid="http://schemas.microsoft.com/office/word/2016/wordml/cid" xmlns:w16se="http://schemas.microsoft.com/office/word/2015/wordml/symex" xmlns:wpg="http://schemas.microsoft.com/office/word/2010/wordprocessingGroup" xmlns:wpi="http://schemas.microsoft.com/office/word/2010/wordprocessingInk" xmlns:wne="http://schemas.microsoft.com/office/word/2006/wordml" xmlns:wps="http://schemas.microsoft.com/office/word/2010/wordprocessingShape" mc:Ignorable="w14 w15 w16se w16cid wp14">
   <w:abstractNum w:abstractNumId="0" w15:restartNumberingAfterBreak="0">
+    <w:nsid w:val="0E5C0B5F"/>
+    <w:multiLevelType w:val="multilevel"/>
+    <w:tmpl w:val="D6FC357E"/>
+    <w:lvl w:ilvl="0">
+      <w:start w:val="1"/>
+      <w:numFmt w:val="bullet"/>
+      <w:lvlText w:val=""/>
+      <w:lvlJc w:val="left"/>
+      <w:pPr>
+        <w:tabs>
+          <w:tab w:val="num" w:pos="720"/>
+        </w:tabs>
+        <w:ind w:left="720" w:hanging="360"/>
+      </w:pPr>
+      <w:rPr>
+        <w:rFonts w:ascii="Symbol" w:hAnsi="Symbol" w:hint="default"/>
+        <w:sz w:val="20"/>
+      </w:rPr>
+    </w:lvl>
+    <w:lvl w:ilvl="1" w:tentative="1">
+      <w:start w:val="1"/>
+      <w:numFmt w:val="bullet"/>
+      <w:lvlText w:val="o"/>
+      <w:lvlJc w:val="left"/>
+      <w:pPr>
+        <w:tabs>
+          <w:tab w:val="num" w:pos="1440"/>
+        </w:tabs>
+        <w:ind w:left="1440" w:hanging="360"/>
+      </w:pPr>
+      <w:rPr>
+        <w:rFonts w:ascii="Courier New" w:hAnsi="Courier New" w:hint="default"/>
+        <w:sz w:val="20"/>
+      </w:rPr>
+    </w:lvl>
+    <w:lvl w:ilvl="2" w:tentative="1">
+      <w:start w:val="1"/>
+      <w:numFmt w:val="bullet"/>
+      <w:lvlText w:val=""/>
+      <w:lvlJc w:val="left"/>
+      <w:pPr>
+        <w:tabs>
+          <w:tab w:val="num" w:pos="2160"/>
+        </w:tabs>
+        <w:ind w:left="2160" w:hanging="360"/>
+      </w:pPr>
+      <w:rPr>
+        <w:rFonts w:ascii="Wingdings" w:hAnsi="Wingdings" w:hint="default"/>
+        <w:sz w:val="20"/>
+      </w:rPr>
+    </w:lvl>
+    <w:lvl w:ilvl="3" w:tentative="1">
+      <w:start w:val="1"/>
+      <w:numFmt w:val="bullet"/>
+      <w:lvlText w:val=""/>
+      <w:lvlJc w:val="left"/>
+      <w:pPr>
+        <w:tabs>
+          <w:tab w:val="num" w:pos="2880"/>
+        </w:tabs>
+        <w:ind w:left="2880" w:hanging="360"/>
+      </w:pPr>
+      <w:rPr>
+        <w:rFonts w:ascii="Wingdings" w:hAnsi="Wingdings" w:hint="default"/>
+        <w:sz w:val="20"/>
+      </w:rPr>
+    </w:lvl>
+    <w:lvl w:ilvl="4" w:tentative="1">
+      <w:start w:val="1"/>
+      <w:numFmt w:val="bullet"/>
+      <w:lvlText w:val=""/>
+      <w:lvlJc w:val="left"/>
+      <w:pPr>
+        <w:tabs>
+          <w:tab w:val="num" w:pos="3600"/>
+        </w:tabs>
+        <w:ind w:left="3600" w:hanging="360"/>
+      </w:pPr>
+      <w:rPr>
+        <w:rFonts w:ascii="Wingdings" w:hAnsi="Wingdings" w:hint="default"/>
+        <w:sz w:val="20"/>
+      </w:rPr>
+    </w:lvl>
+    <w:lvl w:ilvl="5" w:tentative="1">
+      <w:start w:val="1"/>
+      <w:numFmt w:val="bullet"/>
+      <w:lvlText w:val=""/>
+      <w:lvlJc w:val="left"/>
+      <w:pPr>
+        <w:tabs>
+          <w:tab w:val="num" w:pos="4320"/>
+        </w:tabs>
+        <w:ind w:left="4320" w:hanging="360"/>
+      </w:pPr>
+      <w:rPr>
+        <w:rFonts w:ascii="Wingdings" w:hAnsi="Wingdings" w:hint="default"/>
+        <w:sz w:val="20"/>
+      </w:rPr>
+    </w:lvl>
+    <w:lvl w:ilvl="6" w:tentative="1">
+      <w:start w:val="1"/>
+      <w:numFmt w:val="bullet"/>
+      <w:lvlText w:val=""/>
+      <w:lvlJc w:val="left"/>
+      <w:pPr>
+        <w:tabs>
+          <w:tab w:val="num" w:pos="5040"/>
+        </w:tabs>
+        <w:ind w:left="5040" w:hanging="360"/>
+      </w:pPr>
+      <w:rPr>
+        <w:rFonts w:ascii="Wingdings" w:hAnsi="Wingdings" w:hint="default"/>
+        <w:sz w:val="20"/>
+      </w:rPr>
+    </w:lvl>
+    <w:lvl w:ilvl="7" w:tentative="1">
+      <w:start w:val="1"/>
+      <w:numFmt w:val="bullet"/>
+      <w:lvlText w:val=""/>
+      <w:lvlJc w:val="left"/>
+      <w:pPr>
+        <w:tabs>
+          <w:tab w:val="num" w:pos="5760"/>
+        </w:tabs>
+        <w:ind w:left="5760" w:hanging="360"/>
+      </w:pPr>
+      <w:rPr>
+        <w:rFonts w:ascii="Wingdings" w:hAnsi="Wingdings" w:hint="default"/>
+        <w:sz w:val="20"/>
+      </w:rPr>
+    </w:lvl>
+    <w:lvl w:ilvl="8" w:tentative="1">
+      <w:start w:val="1"/>
+      <w:numFmt w:val="bullet"/>
+      <w:lvlText w:val=""/>
+      <w:lvlJc w:val="left"/>
+      <w:pPr>
+        <w:tabs>
+          <w:tab w:val="num" w:pos="6480"/>
+        </w:tabs>
+        <w:ind w:left="6480" w:hanging="360"/>
+      </w:pPr>
+      <w:rPr>
+        <w:rFonts w:ascii="Wingdings" w:hAnsi="Wingdings" w:hint="default"/>
+        <w:sz w:val="20"/>
+      </w:rPr>
+    </w:lvl>
+  </w:abstractNum>
+  <w:abstractNum w:abstractNumId="1" w15:restartNumberingAfterBreak="0">
+    <w:nsid w:val="2831277C"/>
+    <w:multiLevelType w:val="multilevel"/>
+    <w:tmpl w:val="EFFE7698"/>
+    <w:lvl w:ilvl="0">
+      <w:start w:val="1"/>
+      <w:numFmt w:val="bullet"/>
+      <w:lvlText w:val=""/>
+      <w:lvlJc w:val="left"/>
+      <w:pPr>
+        <w:tabs>
+          <w:tab w:val="num" w:pos="720"/>
+        </w:tabs>
+        <w:ind w:left="720" w:hanging="360"/>
+      </w:pPr>
+      <w:rPr>
+        <w:rFonts w:ascii="Symbol" w:hAnsi="Symbol" w:hint="default"/>
+        <w:sz w:val="20"/>
+      </w:rPr>
+    </w:lvl>
+    <w:lvl w:ilvl="1" w:tentative="1">
+      <w:start w:val="1"/>
+      <w:numFmt w:val="bullet"/>
+      <w:lvlText w:val="o"/>
+      <w:lvlJc w:val="left"/>
+      <w:pPr>
+        <w:tabs>
+          <w:tab w:val="num" w:pos="1440"/>
+        </w:tabs>
+        <w:ind w:left="1440" w:hanging="360"/>
+      </w:pPr>
+      <w:rPr>
+        <w:rFonts w:ascii="Courier New" w:hAnsi="Courier New" w:hint="default"/>
+        <w:sz w:val="20"/>
+      </w:rPr>
+    </w:lvl>
+    <w:lvl w:ilvl="2" w:tentative="1">
+      <w:start w:val="1"/>
+      <w:numFmt w:val="bullet"/>
+      <w:lvlText w:val=""/>
+      <w:lvlJc w:val="left"/>
+      <w:pPr>
+        <w:tabs>
+          <w:tab w:val="num" w:pos="2160"/>
+        </w:tabs>
+        <w:ind w:left="2160" w:hanging="360"/>
+      </w:pPr>
+      <w:rPr>
+        <w:rFonts w:ascii="Wingdings" w:hAnsi="Wingdings" w:hint="default"/>
+        <w:sz w:val="20"/>
+      </w:rPr>
+    </w:lvl>
+    <w:lvl w:ilvl="3" w:tentative="1">
+      <w:start w:val="1"/>
+      <w:numFmt w:val="bullet"/>
+      <w:lvlText w:val=""/>
+      <w:lvlJc w:val="left"/>
+      <w:pPr>
+        <w:tabs>
+          <w:tab w:val="num" w:pos="2880"/>
+        </w:tabs>
+        <w:ind w:left="2880" w:hanging="360"/>
+      </w:pPr>
+      <w:rPr>
+        <w:rFonts w:ascii="Wingdings" w:hAnsi="Wingdings" w:hint="default"/>
+        <w:sz w:val="20"/>
+      </w:rPr>
+    </w:lvl>
+    <w:lvl w:ilvl="4" w:tentative="1">
+      <w:start w:val="1"/>
+      <w:numFmt w:val="bullet"/>
+      <w:lvlText w:val=""/>
+      <w:lvlJc w:val="left"/>
+      <w:pPr>
+        <w:tabs>
+          <w:tab w:val="num" w:pos="3600"/>
+        </w:tabs>
+        <w:ind w:left="3600" w:hanging="360"/>
+      </w:pPr>
+      <w:rPr>
+        <w:rFonts w:ascii="Wingdings" w:hAnsi="Wingdings" w:hint="default"/>
+        <w:sz w:val="20"/>
+      </w:rPr>
+    </w:lvl>
+    <w:lvl w:ilvl="5" w:tentative="1">
+      <w:start w:val="1"/>
+      <w:numFmt w:val="bullet"/>
+      <w:lvlText w:val=""/>
+      <w:lvlJc w:val="left"/>
+      <w:pPr>
+        <w:tabs>
+          <w:tab w:val="num" w:pos="4320"/>
+        </w:tabs>
+        <w:ind w:left="4320" w:hanging="360"/>
+      </w:pPr>
+      <w:rPr>
+        <w:rFonts w:ascii="Wingdings" w:hAnsi="Wingdings" w:hint="default"/>
+        <w:sz w:val="20"/>
+      </w:rPr>
+    </w:lvl>
+    <w:lvl w:ilvl="6" w:tentative="1">
+      <w:start w:val="1"/>
+      <w:numFmt w:val="bullet"/>
+      <w:lvlText w:val=""/>
+      <w:lvlJc w:val="left"/>
+      <w:pPr>
+        <w:tabs>
+          <w:tab w:val="num" w:pos="5040"/>
+        </w:tabs>
+        <w:ind w:left="5040" w:hanging="360"/>
+      </w:pPr>
+      <w:rPr>
+        <w:rFonts w:ascii="Wingdings" w:hAnsi="Wingdings" w:hint="default"/>
+        <w:sz w:val="20"/>
+      </w:rPr>
+    </w:lvl>
+    <w:lvl w:ilvl="7" w:tentative="1">
+      <w:start w:val="1"/>
+      <w:numFmt w:val="bullet"/>
+      <w:lvlText w:val=""/>
+      <w:lvlJc w:val="left"/>
+      <w:pPr>
+        <w:tabs>
+          <w:tab w:val="num" w:pos="5760"/>
+        </w:tabs>
+        <w:ind w:left="5760" w:hanging="360"/>
+      </w:pPr>
+      <w:rPr>
+        <w:rFonts w:ascii="Wingdings" w:hAnsi="Wingdings" w:hint="default"/>
+        <w:sz w:val="20"/>
+      </w:rPr>
+    </w:lvl>
+    <w:lvl w:ilvl="8" w:tentative="1">
+      <w:start w:val="1"/>
+      <w:numFmt w:val="bullet"/>
+      <w:lvlText w:val=""/>
+      <w:lvlJc w:val="left"/>
+      <w:pPr>
+        <w:tabs>
+          <w:tab w:val="num" w:pos="6480"/>
+        </w:tabs>
+        <w:ind w:left="6480" w:hanging="360"/>
+      </w:pPr>
+      <w:rPr>
+        <w:rFonts w:ascii="Wingdings" w:hAnsi="Wingdings" w:hint="default"/>
+        <w:sz w:val="20"/>
+      </w:rPr>
+    </w:lvl>
+  </w:abstractNum>
+  <w:abstractNum w:abstractNumId="2" w15:restartNumberingAfterBreak="0">
     <w:nsid w:val="441A561D"/>
     <w:multiLevelType w:val="hybridMultilevel"/>
     <w:tmpl w:val="C206E7DA"/>
@@ -2754,7 +3551,7 @@
       </w:rPr>
     </w:lvl>
   </w:abstractNum>
-  <w:abstractNum w:abstractNumId="1" w15:restartNumberingAfterBreak="0">
+  <w:abstractNum w:abstractNumId="3" w15:restartNumberingAfterBreak="0">
     <w:nsid w:val="4AAB3F98"/>
     <w:multiLevelType w:val="hybridMultilevel"/>
     <w:tmpl w:val="13307F2C"/>
@@ -2867,7 +3664,7 @@
       </w:rPr>
     </w:lvl>
   </w:abstractNum>
-  <w:abstractNum w:abstractNumId="2" w15:restartNumberingAfterBreak="0">
+  <w:abstractNum w:abstractNumId="4" w15:restartNumberingAfterBreak="0">
     <w:nsid w:val="4F180584"/>
     <w:multiLevelType w:val="hybridMultilevel"/>
     <w:tmpl w:val="8DAA589A"/>
@@ -2980,7 +3777,7 @@
       </w:rPr>
     </w:lvl>
   </w:abstractNum>
-  <w:abstractNum w:abstractNumId="3" w15:restartNumberingAfterBreak="0">
+  <w:abstractNum w:abstractNumId="5" w15:restartNumberingAfterBreak="0">
     <w:nsid w:val="59764761"/>
     <w:multiLevelType w:val="hybridMultilevel"/>
     <w:tmpl w:val="383A77AE"/>
@@ -3093,7 +3890,7 @@
       </w:rPr>
     </w:lvl>
   </w:abstractNum>
-  <w:abstractNum w:abstractNumId="4" w15:restartNumberingAfterBreak="0">
+  <w:abstractNum w:abstractNumId="6" w15:restartNumberingAfterBreak="0">
     <w:nsid w:val="78F52E30"/>
     <w:multiLevelType w:val="hybridMultilevel"/>
     <w:tmpl w:val="234C89F0"/>
@@ -3180,19 +3977,25 @@
     </w:lvl>
   </w:abstractNum>
   <w:num w:numId="1">
+    <w:abstractNumId w:val="6"/>
+  </w:num>
+  <w:num w:numId="2">
     <w:abstractNumId w:val="4"/>
   </w:num>
-  <w:num w:numId="2">
+  <w:num w:numId="3">
+    <w:abstractNumId w:val="5"/>
+  </w:num>
+  <w:num w:numId="4">
     <w:abstractNumId w:val="2"/>
   </w:num>
-  <w:num w:numId="3">
+  <w:num w:numId="5">
     <w:abstractNumId w:val="3"/>
   </w:num>
-  <w:num w:numId="4">
+  <w:num w:numId="6">
+    <w:abstractNumId w:val="1"/>
+  </w:num>
+  <w:num w:numId="7">
     <w:abstractNumId w:val="0"/>
-  </w:num>
-  <w:num w:numId="5">
-    <w:abstractNumId w:val="1"/>
   </w:num>
 </w:numbering>
 </file>
@@ -3653,6 +4456,48 @@
       </w:tblBorders>
     </w:tblPr>
   </w:style>
+  <w:style w:type="paragraph" w:customStyle="1" w:styleId="pdq2pgselectionanchorcontainer">
+    <w:name w:val="pdq2pg_selectionanchorcontainer"/>
+    <w:basedOn w:val="Normal"/>
+    <w:rsid w:val="00823765"/>
+    <w:pPr>
+      <w:spacing w:before="100" w:beforeAutospacing="1" w:after="100" w:afterAutospacing="1" w:line="240" w:lineRule="auto"/>
+    </w:pPr>
+    <w:rPr>
+      <w:rFonts w:ascii="Times New Roman" w:eastAsia="Times New Roman" w:hAnsi="Times New Roman" w:cs="Times New Roman"/>
+      <w:sz w:val="24"/>
+      <w:szCs w:val="24"/>
+      <w:lang w:eastAsia="es-CO"/>
+    </w:rPr>
+  </w:style>
+  <w:style w:type="character" w:styleId="Textoennegrita">
+    <w:name w:val="Strong"/>
+    <w:basedOn w:val="Fuentedeprrafopredeter"/>
+    <w:uiPriority w:val="22"/>
+    <w:qFormat/>
+    <w:rsid w:val="00823765"/>
+    <w:rPr>
+      <w:b/>
+      <w:bCs/>
+    </w:rPr>
+  </w:style>
+  <w:style w:type="paragraph" w:styleId="NormalWeb">
+    <w:name w:val="Normal (Web)"/>
+    <w:basedOn w:val="Normal"/>
+    <w:uiPriority w:val="99"/>
+    <w:semiHidden/>
+    <w:unhideWhenUsed/>
+    <w:rsid w:val="00823765"/>
+    <w:pPr>
+      <w:spacing w:before="100" w:beforeAutospacing="1" w:after="100" w:afterAutospacing="1" w:line="240" w:lineRule="auto"/>
+    </w:pPr>
+    <w:rPr>
+      <w:rFonts w:ascii="Times New Roman" w:eastAsia="Times New Roman" w:hAnsi="Times New Roman" w:cs="Times New Roman"/>
+      <w:sz w:val="24"/>
+      <w:szCs w:val="24"/>
+      <w:lang w:eastAsia="es-CO"/>
+    </w:rPr>
+  </w:style>
 </w:styles>
 </file>
 

</xml_diff>